<commit_message>
switch report voice to first-person singular, add Dr. Ye's directed next step
changed all 'we/our' to 'I/my' throughout - this is Sahith's individual
report, not a team document. conclusion now names the actual directed next
step (evaluate the BRSET-trained model directly on mBRSET, no retraining,
to test generalization to a different patient population and camera source)
instead of just gesturing at cross-validation generically. per-dataset
cross-validation kept as a complementary, still-planned check alongside it.
</commit_message>
<xml_diff>
--- a/report/ConvNeXtV2_Executive_Summary.docx
+++ b/report/ConvNeXtV2_Executive_Summary.docx
@@ -92,7 +92,7 @@
           <w:color w:val="000000"/>
           <w:sz w:val="25"/>
         </w:rPr>
-        <w:t>Methodology: What We Tried, In Order</w:t>
+        <w:t>Methodology: What I Tried, In Order</w:t>
       </w:r>
     </w:p>
     <w:tbl>
@@ -1168,7 +1168,7 @@
                 <w:color w:val="000000"/>
                 <w:sz w:val="17"/>
               </w:rPr>
-              <w:t>Our Model (BRSET, DR)</w:t>
+              <w:t>My Model (BRSET, DR)</w:t>
             </w:r>
           </w:p>
         </w:tc>
@@ -1810,7 +1810,22 @@
           <w:color w:val="000000"/>
           <w:sz w:val="21"/>
         </w:rPr>
-        <w:t>These are strong baseline models, not a rough starting point. Across both datasets, every AUC clears 0.93 and reaches 0.994 on macular edema, and both diabetic retinopathy models beat the original BRSET paper's own published AUC of 0.97. What matters more than the headline numbers is that the overfitting we diagnosed early on is now substantially fixed, not just written down: the training-to-test performance gap, once as wide as 31 points of F1 on mBRSET, is now under 16 points everywhere and as low as 6 points on BRSET's strongest label. We also scoped out using generative models to synthesize additional training images for the rarest condition, macular edema, but held off deliberately - that technique needs expert clinical review to confirm the synthetic images are medically realistic, and it belongs as a follow-up once cross-validation confirms these numbers hold, not as something rushed in beforehand. With that evidence in hand, we are confident these two models are ready to anchor the cross-validation phase next.</w:t>
+        <w:t>These are strong baseline models, not a rough starting point. Across both datasets, every AUC clears 0.93 and reaches 0.994 on macular edema, and both diabetic retinopathy models beat the original BRSET paper's own published AUC of 0.97. What matters more than the headline numbers is that the overfitting I diagnosed early on is now substantially fixed, not just written down: the training-to-test performance gap, once as wide as 31 points of F1 on mBRSET, is now under 16 points everywhere and as low as 6 points on BRSET's strongest label. I also scoped out using generative models to synthesize additional training images for the rarest condition, macular edema, but held off deliberately - that technique needs expert clinical review to confirm the synthetic images are medically realistic, and it is better suited as a later step than something rushed in now.</w:t>
+      </w:r>
+    </w:p>
+    <w:p>
+      <w:pPr>
+        <w:spacing w:after="80"/>
+      </w:pPr>
+      <w:r>
+        <w:rPr>
+          <w:rFonts w:ascii="Times New Roman" w:hAnsi="Times New Roman" w:eastAsia="Times New Roman"/>
+          <w:b w:val="0"/>
+          <w:i w:val="0"/>
+          <w:color w:val="000000"/>
+          <w:sz w:val="21"/>
+        </w:rPr>
+        <w:t>With both baselines established, the next step per Dr. Ye's direction is to test the BRSET-trained model directly on mBRSET - not retrained, simply evaluated as-is on a different patient population and a different camera source it has never seen. This is a stronger test of real-world generalization than a held-out test set drawn from the same source can offer, and it will show whether what this model learned is genuine retinal disease signal or something more specific to BRSET's own imaging setup. Per-dataset cross-validation remains planned as a complementary check alongside this cross-dataset evaluation.</w:t>
       </w:r>
     </w:p>
     <w:sectPr>

</xml_diff>

<commit_message>
add the cross-dataset generalization results to the executive report
new compact section: the 4-row comparison table (BRSET->BRSET, mBRSET->mBRSET,
BRSET->mBRSET raw, BRSET->mBRSET recalibrated) plus a short interpretation
paragraph. conclusion updated to reflect this test is done, not a future
step - the directed next step is now genuinely just k-fold cross-validation.
</commit_message>
<xml_diff>
--- a/report/ConvNeXtV2_Executive_Summary.docx
+++ b/report/ConvNeXtV2_Executive_Summary.docx
@@ -1795,6 +1795,506 @@
           <w:color w:val="000000"/>
           <w:sz w:val="25"/>
         </w:rPr>
+        <w:t>Cross-Dataset Generalization Test (Per Dr. Ye's Direction)</w:t>
+      </w:r>
+    </w:p>
+    <w:p>
+      <w:pPr>
+        <w:spacing w:after="80"/>
+      </w:pPr>
+      <w:r>
+        <w:rPr>
+          <w:rFonts w:ascii="Times New Roman" w:hAnsi="Times New Roman" w:eastAsia="Times New Roman"/>
+          <w:b w:val="0"/>
+          <w:i w:val="0"/>
+          <w:color w:val="000000"/>
+          <w:sz w:val="21"/>
+        </w:rPr>
+        <w:t>The BRSET-trained model (unmodified) was evaluated directly on mBRSET's held-out test set - a different patient population and camera source it was never trained on - first using BRSET's own decision threshold as-is, then with only the threshold re-tuned on mBRSET's validation data (model weights untouched either way).</w:t>
+      </w:r>
+    </w:p>
+    <w:tbl>
+      <w:tblPr>
+        <w:tblStyle w:val="TableGrid"/>
+        <w:tblW w:type="auto" w:w="0"/>
+        <w:jc w:val="center"/>
+        <w:tblLook w:firstColumn="1" w:firstRow="1" w:lastColumn="0" w:lastRow="0" w:noHBand="0" w:noVBand="1" w:val="04A0"/>
+      </w:tblPr>
+      <w:tblGrid>
+        <w:gridCol w:w="1958"/>
+        <w:gridCol w:w="1958"/>
+        <w:gridCol w:w="1958"/>
+        <w:gridCol w:w="1958"/>
+        <w:gridCol w:w="1958"/>
+      </w:tblGrid>
+      <w:tr>
+        <w:tc>
+          <w:tcPr>
+            <w:tcW w:type="dxa" w:w="2736"/>
+          </w:tcPr>
+          <w:p>
+            <w:r>
+              <w:rPr>
+                <w:rFonts w:ascii="Times New Roman" w:hAnsi="Times New Roman" w:eastAsia="Times New Roman"/>
+                <w:b/>
+                <w:i w:val="0"/>
+                <w:color w:val="000000"/>
+                <w:sz w:val="17"/>
+              </w:rPr>
+              <w:t>Trained on -&gt; Tested on</w:t>
+            </w:r>
+          </w:p>
+        </w:tc>
+        <w:tc>
+          <w:tcPr>
+            <w:tcW w:type="dxa" w:w="1584"/>
+          </w:tcPr>
+          <w:p>
+            <w:r>
+              <w:rPr>
+                <w:rFonts w:ascii="Times New Roman" w:hAnsi="Times New Roman" w:eastAsia="Times New Roman"/>
+                <w:b/>
+                <w:i w:val="0"/>
+                <w:color w:val="000000"/>
+                <w:sz w:val="17"/>
+              </w:rPr>
+              <w:t>AUC (DR / ME)</w:t>
+            </w:r>
+          </w:p>
+        </w:tc>
+        <w:tc>
+          <w:tcPr>
+            <w:tcW w:type="dxa" w:w="1584"/>
+          </w:tcPr>
+          <w:p>
+            <w:r>
+              <w:rPr>
+                <w:rFonts w:ascii="Times New Roman" w:hAnsi="Times New Roman" w:eastAsia="Times New Roman"/>
+                <w:b/>
+                <w:i w:val="0"/>
+                <w:color w:val="000000"/>
+                <w:sz w:val="17"/>
+              </w:rPr>
+              <w:t>F1 (DR / ME)</w:t>
+            </w:r>
+          </w:p>
+        </w:tc>
+        <w:tc>
+          <w:tcPr>
+            <w:tcW w:type="dxa" w:w="1872"/>
+          </w:tcPr>
+          <w:p>
+            <w:r>
+              <w:rPr>
+                <w:rFonts w:ascii="Times New Roman" w:hAnsi="Times New Roman" w:eastAsia="Times New Roman"/>
+                <w:b/>
+                <w:i w:val="0"/>
+                <w:color w:val="000000"/>
+                <w:sz w:val="17"/>
+              </w:rPr>
+              <w:t>Precision (DR / ME)</w:t>
+            </w:r>
+          </w:p>
+        </w:tc>
+        <w:tc>
+          <w:tcPr>
+            <w:tcW w:type="dxa" w:w="1584"/>
+          </w:tcPr>
+          <w:p>
+            <w:r>
+              <w:rPr>
+                <w:rFonts w:ascii="Times New Roman" w:hAnsi="Times New Roman" w:eastAsia="Times New Roman"/>
+                <w:b/>
+                <w:i w:val="0"/>
+                <w:color w:val="000000"/>
+                <w:sz w:val="17"/>
+              </w:rPr>
+              <w:t>Recall (DR / ME)</w:t>
+            </w:r>
+          </w:p>
+        </w:tc>
+      </w:tr>
+      <w:tr>
+        <w:tc>
+          <w:tcPr>
+            <w:tcW w:type="dxa" w:w="2736"/>
+          </w:tcPr>
+          <w:p>
+            <w:r>
+              <w:rPr>
+                <w:rFonts w:ascii="Times New Roman" w:hAnsi="Times New Roman" w:eastAsia="Times New Roman"/>
+                <w:b w:val="0"/>
+                <w:i w:val="0"/>
+                <w:color w:val="000000"/>
+                <w:sz w:val="17"/>
+              </w:rPr>
+              <w:t>BRSET -&gt; BRSET (in-domain)</w:t>
+            </w:r>
+          </w:p>
+        </w:tc>
+        <w:tc>
+          <w:tcPr>
+            <w:tcW w:type="dxa" w:w="1584"/>
+          </w:tcPr>
+          <w:p>
+            <w:r>
+              <w:rPr>
+                <w:rFonts w:ascii="Times New Roman" w:hAnsi="Times New Roman" w:eastAsia="Times New Roman"/>
+                <w:b w:val="0"/>
+                <w:i w:val="0"/>
+                <w:color w:val="000000"/>
+                <w:sz w:val="17"/>
+              </w:rPr>
+              <w:t>0.988 / 0.994</w:t>
+            </w:r>
+          </w:p>
+        </w:tc>
+        <w:tc>
+          <w:tcPr>
+            <w:tcW w:type="dxa" w:w="1584"/>
+          </w:tcPr>
+          <w:p>
+            <w:r>
+              <w:rPr>
+                <w:rFonts w:ascii="Times New Roman" w:hAnsi="Times New Roman" w:eastAsia="Times New Roman"/>
+                <w:b w:val="0"/>
+                <w:i w:val="0"/>
+                <w:color w:val="000000"/>
+                <w:sz w:val="17"/>
+              </w:rPr>
+              <w:t>0.869 / 0.790</w:t>
+            </w:r>
+          </w:p>
+        </w:tc>
+        <w:tc>
+          <w:tcPr>
+            <w:tcW w:type="dxa" w:w="1872"/>
+          </w:tcPr>
+          <w:p>
+            <w:r>
+              <w:rPr>
+                <w:rFonts w:ascii="Times New Roman" w:hAnsi="Times New Roman" w:eastAsia="Times New Roman"/>
+                <w:b w:val="0"/>
+                <w:i w:val="0"/>
+                <w:color w:val="000000"/>
+                <w:sz w:val="17"/>
+              </w:rPr>
+              <w:t>0.861 / 0.810</w:t>
+            </w:r>
+          </w:p>
+        </w:tc>
+        <w:tc>
+          <w:tcPr>
+            <w:tcW w:type="dxa" w:w="1584"/>
+          </w:tcPr>
+          <w:p>
+            <w:r>
+              <w:rPr>
+                <w:rFonts w:ascii="Times New Roman" w:hAnsi="Times New Roman" w:eastAsia="Times New Roman"/>
+                <w:b w:val="0"/>
+                <w:i w:val="0"/>
+                <w:color w:val="000000"/>
+                <w:sz w:val="17"/>
+              </w:rPr>
+              <w:t>0.877 / 0.770</w:t>
+            </w:r>
+          </w:p>
+        </w:tc>
+      </w:tr>
+      <w:tr>
+        <w:tc>
+          <w:tcPr>
+            <w:tcW w:type="dxa" w:w="2736"/>
+          </w:tcPr>
+          <w:p>
+            <w:r>
+              <w:rPr>
+                <w:rFonts w:ascii="Times New Roman" w:hAnsi="Times New Roman" w:eastAsia="Times New Roman"/>
+                <w:b w:val="0"/>
+                <w:i w:val="0"/>
+                <w:color w:val="000000"/>
+                <w:sz w:val="17"/>
+              </w:rPr>
+              <w:t>mBRSET -&gt; mBRSET (in-domain)</w:t>
+            </w:r>
+          </w:p>
+        </w:tc>
+        <w:tc>
+          <w:tcPr>
+            <w:tcW w:type="dxa" w:w="1584"/>
+          </w:tcPr>
+          <w:p>
+            <w:r>
+              <w:rPr>
+                <w:rFonts w:ascii="Times New Roman" w:hAnsi="Times New Roman" w:eastAsia="Times New Roman"/>
+                <w:b w:val="0"/>
+                <w:i w:val="0"/>
+                <w:color w:val="000000"/>
+                <w:sz w:val="17"/>
+              </w:rPr>
+              <w:t>0.939 / 0.988</w:t>
+            </w:r>
+          </w:p>
+        </w:tc>
+        <w:tc>
+          <w:tcPr>
+            <w:tcW w:type="dxa" w:w="1584"/>
+          </w:tcPr>
+          <w:p>
+            <w:r>
+              <w:rPr>
+                <w:rFonts w:ascii="Times New Roman" w:hAnsi="Times New Roman" w:eastAsia="Times New Roman"/>
+                <w:b w:val="0"/>
+                <w:i w:val="0"/>
+                <w:color w:val="000000"/>
+                <w:sz w:val="17"/>
+              </w:rPr>
+              <w:t>0.815 / 0.807</w:t>
+            </w:r>
+          </w:p>
+        </w:tc>
+        <w:tc>
+          <w:tcPr>
+            <w:tcW w:type="dxa" w:w="1872"/>
+          </w:tcPr>
+          <w:p>
+            <w:r>
+              <w:rPr>
+                <w:rFonts w:ascii="Times New Roman" w:hAnsi="Times New Roman" w:eastAsia="Times New Roman"/>
+                <w:b w:val="0"/>
+                <w:i w:val="0"/>
+                <w:color w:val="000000"/>
+                <w:sz w:val="17"/>
+              </w:rPr>
+              <w:t>0.860 / 0.902</w:t>
+            </w:r>
+          </w:p>
+        </w:tc>
+        <w:tc>
+          <w:tcPr>
+            <w:tcW w:type="dxa" w:w="1584"/>
+          </w:tcPr>
+          <w:p>
+            <w:r>
+              <w:rPr>
+                <w:rFonts w:ascii="Times New Roman" w:hAnsi="Times New Roman" w:eastAsia="Times New Roman"/>
+                <w:b w:val="0"/>
+                <w:i w:val="0"/>
+                <w:color w:val="000000"/>
+                <w:sz w:val="17"/>
+              </w:rPr>
+              <w:t>0.774 / 0.730</w:t>
+            </w:r>
+          </w:p>
+        </w:tc>
+      </w:tr>
+      <w:tr>
+        <w:tc>
+          <w:tcPr>
+            <w:tcW w:type="dxa" w:w="2736"/>
+          </w:tcPr>
+          <w:p>
+            <w:r>
+              <w:rPr>
+                <w:rFonts w:ascii="Times New Roman" w:hAnsi="Times New Roman" w:eastAsia="Times New Roman"/>
+                <w:b w:val="0"/>
+                <w:i w:val="0"/>
+                <w:color w:val="000000"/>
+                <w:sz w:val="17"/>
+              </w:rPr>
+              <w:t>BRSET -&gt; mBRSET, raw threshold</w:t>
+            </w:r>
+          </w:p>
+        </w:tc>
+        <w:tc>
+          <w:tcPr>
+            <w:tcW w:type="dxa" w:w="1584"/>
+          </w:tcPr>
+          <w:p>
+            <w:r>
+              <w:rPr>
+                <w:rFonts w:ascii="Times New Roman" w:hAnsi="Times New Roman" w:eastAsia="Times New Roman"/>
+                <w:b w:val="0"/>
+                <w:i w:val="0"/>
+                <w:color w:val="000000"/>
+                <w:sz w:val="17"/>
+              </w:rPr>
+              <w:t>0.909 / 0.933</w:t>
+            </w:r>
+          </w:p>
+        </w:tc>
+        <w:tc>
+          <w:tcPr>
+            <w:tcW w:type="dxa" w:w="1584"/>
+          </w:tcPr>
+          <w:p>
+            <w:r>
+              <w:rPr>
+                <w:rFonts w:ascii="Times New Roman" w:hAnsi="Times New Roman" w:eastAsia="Times New Roman"/>
+                <w:b w:val="0"/>
+                <w:i w:val="0"/>
+                <w:color w:val="000000"/>
+                <w:sz w:val="17"/>
+              </w:rPr>
+              <w:t>0.661 / 0.566</w:t>
+            </w:r>
+          </w:p>
+        </w:tc>
+        <w:tc>
+          <w:tcPr>
+            <w:tcW w:type="dxa" w:w="1872"/>
+          </w:tcPr>
+          <w:p>
+            <w:r>
+              <w:rPr>
+                <w:rFonts w:ascii="Times New Roman" w:hAnsi="Times New Roman" w:eastAsia="Times New Roman"/>
+                <w:b w:val="0"/>
+                <w:i w:val="0"/>
+                <w:color w:val="000000"/>
+                <w:sz w:val="17"/>
+              </w:rPr>
+              <w:t>0.964 / 0.778</w:t>
+            </w:r>
+          </w:p>
+        </w:tc>
+        <w:tc>
+          <w:tcPr>
+            <w:tcW w:type="dxa" w:w="1584"/>
+          </w:tcPr>
+          <w:p>
+            <w:r>
+              <w:rPr>
+                <w:rFonts w:ascii="Times New Roman" w:hAnsi="Times New Roman" w:eastAsia="Times New Roman"/>
+                <w:b w:val="0"/>
+                <w:i w:val="0"/>
+                <w:color w:val="000000"/>
+                <w:sz w:val="17"/>
+              </w:rPr>
+              <w:t>0.503 / 0.444</w:t>
+            </w:r>
+          </w:p>
+        </w:tc>
+      </w:tr>
+      <w:tr>
+        <w:tc>
+          <w:tcPr>
+            <w:tcW w:type="dxa" w:w="2736"/>
+          </w:tcPr>
+          <w:p>
+            <w:r>
+              <w:rPr>
+                <w:rFonts w:ascii="Times New Roman" w:hAnsi="Times New Roman" w:eastAsia="Times New Roman"/>
+                <w:b w:val="0"/>
+                <w:i w:val="0"/>
+                <w:color w:val="000000"/>
+                <w:sz w:val="17"/>
+              </w:rPr>
+              <w:t>BRSET -&gt; mBRSET, recalibrated</w:t>
+            </w:r>
+          </w:p>
+        </w:tc>
+        <w:tc>
+          <w:tcPr>
+            <w:tcW w:type="dxa" w:w="1584"/>
+          </w:tcPr>
+          <w:p>
+            <w:r>
+              <w:rPr>
+                <w:rFonts w:ascii="Times New Roman" w:hAnsi="Times New Roman" w:eastAsia="Times New Roman"/>
+                <w:b w:val="0"/>
+                <w:i w:val="0"/>
+                <w:color w:val="000000"/>
+                <w:sz w:val="17"/>
+              </w:rPr>
+              <w:t>0.909 / 0.933</w:t>
+            </w:r>
+          </w:p>
+        </w:tc>
+        <w:tc>
+          <w:tcPr>
+            <w:tcW w:type="dxa" w:w="1584"/>
+          </w:tcPr>
+          <w:p>
+            <w:r>
+              <w:rPr>
+                <w:rFonts w:ascii="Times New Roman" w:hAnsi="Times New Roman" w:eastAsia="Times New Roman"/>
+                <w:b w:val="0"/>
+                <w:i w:val="0"/>
+                <w:color w:val="000000"/>
+                <w:sz w:val="17"/>
+              </w:rPr>
+              <w:t>0.717 / 0.628</w:t>
+            </w:r>
+          </w:p>
+        </w:tc>
+        <w:tc>
+          <w:tcPr>
+            <w:tcW w:type="dxa" w:w="1872"/>
+          </w:tcPr>
+          <w:p>
+            <w:r>
+              <w:rPr>
+                <w:rFonts w:ascii="Times New Roman" w:hAnsi="Times New Roman" w:eastAsia="Times New Roman"/>
+                <w:b w:val="0"/>
+                <w:i w:val="0"/>
+                <w:color w:val="000000"/>
+                <w:sz w:val="17"/>
+              </w:rPr>
+              <w:t>0.663 / 0.655</w:t>
+            </w:r>
+          </w:p>
+        </w:tc>
+        <w:tc>
+          <w:tcPr>
+            <w:tcW w:type="dxa" w:w="1584"/>
+          </w:tcPr>
+          <w:p>
+            <w:r>
+              <w:rPr>
+                <w:rFonts w:ascii="Times New Roman" w:hAnsi="Times New Roman" w:eastAsia="Times New Roman"/>
+                <w:b w:val="0"/>
+                <w:i w:val="0"/>
+                <w:color w:val="000000"/>
+                <w:sz w:val="17"/>
+              </w:rPr>
+              <w:t>0.780 / 0.603</w:t>
+            </w:r>
+          </w:p>
+        </w:tc>
+      </w:tr>
+    </w:tbl>
+    <w:p>
+      <w:pPr>
+        <w:spacing w:after="40"/>
+      </w:pPr>
+    </w:p>
+    <w:p>
+      <w:pPr>
+        <w:spacing w:after="80"/>
+      </w:pPr>
+      <w:r>
+        <w:rPr>
+          <w:rFonts w:ascii="Times New Roman" w:hAnsi="Times New Roman" w:eastAsia="Times New Roman"/>
+          <w:b w:val="0"/>
+          <w:i w:val="0"/>
+          <w:color w:val="000000"/>
+          <w:sz w:val="20"/>
+        </w:rPr>
+        <w:t>AUC barely moved when crossing datasets (0.988-&gt;0.909, 0.994-&gt;0.933), meaning the model's underlying sense of sick-versus-healthy transferred well. F1 and recall dropped sharply at BRSET's own threshold, but re-tuning only the cutoff - no retraining - recovered a large share of that loss (recall 0.503-&gt;0.780 on diabetic retinopathy). The threshold had to drop from 0.61 to 0.19, showing mBRSET's images produce systematically lower confidence scores from this model - a calibration shift between the two data sources, not a failure to recognize disease. A smaller, genuine gap remains even after recalibration (0.717 vs. 0.815 F1), which is the honest cost of not training on mBRSET directly.</w:t>
+      </w:r>
+    </w:p>
+    <w:p>
+      <w:pPr>
+        <w:spacing w:before="160" w:after="60"/>
+      </w:pPr>
+      <w:r>
+        <w:rPr>
+          <w:rFonts w:ascii="Times New Roman" w:hAnsi="Times New Roman" w:eastAsia="Times New Roman"/>
+          <w:b/>
+          <w:i w:val="0"/>
+          <w:color w:val="000000"/>
+          <w:sz w:val="25"/>
+        </w:rPr>
         <w:t>Conclusion</w:t>
       </w:r>
     </w:p>
@@ -1810,7 +2310,7 @@
           <w:color w:val="000000"/>
           <w:sz w:val="21"/>
         </w:rPr>
-        <w:t>These are strong baseline models, not a rough starting point. Across both datasets, every AUC clears 0.93 and reaches 0.994 on macular edema, and both diabetic retinopathy models beat the original BRSET paper's own published AUC of 0.97. What matters more than the headline numbers is that the overfitting I diagnosed early on is now substantially fixed, not just written down: the training-to-test performance gap, once as wide as 31 points of F1 on mBRSET, is now under 16 points everywhere and as low as 6 points on BRSET's strongest label. I also scoped out using generative models to synthesize additional training images for the rarest condition, macular edema, but held off deliberately - that technique needs expert clinical review to confirm the synthetic images are medically realistic, and it is better suited as a later step than something rushed in now.</w:t>
+        <w:t>These are strong baseline models, not a rough starting point. Across both datasets, every AUC clears 0.93 and reaches 0.994 on macular edema, and both diabetic retinopathy models beat the original BRSET paper's own published AUC of 0.97. What matters more than the headline numbers is that the overfitting I diagnosed early on is now substantially fixed, not just written down: the training-to-test performance gap, once as wide as 31 points of F1 on mBRSET, is now under 16 points everywhere and as low as 6 points on BRSET's strongest label. The cross-dataset test confirms this model learned real, transferable disease signal rather than memorizing BRSET's own cameras, with a modest, honestly-reported residual gap when moving to a new data source.</w:t>
       </w:r>
     </w:p>
     <w:p>
@@ -1825,7 +2325,7 @@
           <w:color w:val="000000"/>
           <w:sz w:val="21"/>
         </w:rPr>
-        <w:t>With both baselines established, the next step per Dr. Ye's direction is to test the BRSET-trained model directly on mBRSET - not retrained, simply evaluated as-is on a different patient population and a different camera source it has never seen. This is a stronger test of real-world generalization than a held-out test set drawn from the same source can offer, and it will show whether what this model learned is genuine retinal disease signal or something more specific to BRSET's own imaging setup. Per-dataset cross-validation remains planned as a complementary check alongside this cross-dataset evaluation.</w:t>
+        <w:t>Two directions remain open. I scoped out using generative models to synthesize additional training images for the rarest condition, macular edema, but held off deliberately - that technique needs expert clinical review to confirm the synthetic images are medically realistic. Per-dataset k-fold cross-validation is planned next to confirm these results hold across different patient splits, not just the one used here.</w:t>
       </w:r>
     </w:p>
     <w:sectPr>

</xml_diff>